<commit_message>
Trim the UART lab document to setup and the tasks
- Remove the overview text, learning outcomes and the 'How UART works'
  theory section; Equipment, Software and LCD wiring stay as '1 Setup'
- Renumber the task sections 2-6
- Exercises 1d and 2b no longer point at the removed section: each now
  states the facts it needs (10-bit frame at 9600 baud; baud rate,
  TX-to-RX and shared ground)

Co-Authored-By: Claude Opus 5.5 <noreply@anthropic.com>
Claude-Session: https://claude.ai/code/session_01CiECTAXnMczefiojQ3XYbF
</commit_message>
<xml_diff>
--- a/UART_Communication/W04 LAB UART Communication and Data Integrity.docx
+++ b/UART_Communication/W04 LAB UART Communication and Data Integrity.docx
@@ -259,147 +259,9 @@
           <w:b/>
           <w:bCs/>
         </w:rPr>
-        <w:t>1  Overview</w:t>
+        <w:t xml:space="preserve">1  Setup</w:t>
       </w:r>
       <w:proofErr w:type="gramEnd"/>
-    </w:p>
-    <w:p>
-      <w:pPr>
-        <w:spacing w:after="120" w:line="264" w:lineRule="auto"/>
-      </w:pPr>
-      <w:r>
-        <w:rPr>
-          <w:b/>
-          <w:bCs/>
-        </w:rPr>
-        <w:t>UART</w:t>
-      </w:r>
-      <w:r>
-        <w:t xml:space="preserve"> (Universal Asynchronous Receiver/Transmitter) is the simplest and most widely used way for two chips to talk: GPS modules, Bluetooth modules, GSM modems and the USB link to your PC all use it. Data travels one bit at a time down a single wire in each direction, with no shared clock. Both sides simply agree on the speed (the </w:t>
-      </w:r>
-      <w:r>
-        <w:rPr>
-          <w:i/>
-          <w:iCs/>
-        </w:rPr>
-        <w:t>baud rate</w:t>
-      </w:r>
-      <w:r>
-        <w:t>) in advance.</w:t>
-      </w:r>
-    </w:p>
-    <w:p>
-      <w:pPr>
-        <w:spacing w:after="120" w:line="264" w:lineRule="auto"/>
-      </w:pPr>
-      <w:r>
-        <w:t xml:space="preserve">In this lab you will send data from an Arduino back to itself, then between two Arduinos, and finally add a </w:t>
-      </w:r>
-      <w:r>
-        <w:rPr>
-          <w:b/>
-          <w:bCs/>
-        </w:rPr>
-        <w:t>SHA-1 hash</w:t>
-      </w:r>
-      <w:r>
-        <w:t xml:space="preserve"> to every message so the receiver can detect whether anything was corrupted on the way.</w:t>
-      </w:r>
-    </w:p>
-    <w:p>
-      <w:pPr>
-        <w:pStyle w:val="Heading3"/>
-        <w:keepNext/>
-        <w:spacing w:before="180" w:after="60"/>
-      </w:pPr>
-      <w:r>
-        <w:rPr>
-          <w:b/>
-          <w:bCs/>
-        </w:rPr>
-        <w:t>Learning outcomes</w:t>
-      </w:r>
-    </w:p>
-    <w:p>
-      <w:pPr>
-        <w:spacing w:after="60" w:line="264" w:lineRule="auto"/>
-      </w:pPr>
-      <w:r>
-        <w:t>By the end of this lab you should be able to:</w:t>
-      </w:r>
-    </w:p>
-    <w:p>
-      <w:pPr>
-        <w:pStyle w:val="ListParagraph"/>
-        <w:numPr>
-          <w:ilvl w:val="0"/>
-          <w:numId w:val="1"/>
-        </w:numPr>
-        <w:spacing w:after="60" w:line="264" w:lineRule="auto"/>
-      </w:pPr>
-      <w:r>
-        <w:t>Describe a UART frame (start bit, data bits, stop bit) and calculate transmission time from the baud rate.</w:t>
-      </w:r>
-    </w:p>
-    <w:p>
-      <w:pPr>
-        <w:pStyle w:val="ListParagraph"/>
-        <w:numPr>
-          <w:ilvl w:val="0"/>
-          <w:numId w:val="1"/>
-        </w:numPr>
-        <w:spacing w:after="60" w:line="264" w:lineRule="auto"/>
-      </w:pPr>
-      <w:r>
-        <w:t>Wire a loopback test and a two-board TX/RX link with a common ground.</w:t>
-      </w:r>
-    </w:p>
-    <w:p>
-      <w:pPr>
-        <w:pStyle w:val="ListParagraph"/>
-        <w:numPr>
-          <w:ilvl w:val="0"/>
-          <w:numId w:val="1"/>
-        </w:numPr>
-        <w:spacing w:after="60" w:line="264" w:lineRule="auto"/>
-      </w:pPr>
-      <w:r>
-        <w:t xml:space="preserve">Explain how non-blocking </w:t>
-      </w:r>
-      <w:r>
-        <w:rPr>
-          <w:rFonts w:ascii="Consolas" w:hAnsi="Consolas" w:cs="Consolas"/>
-          <w:color w:val="C7254E"/>
-          <w:sz w:val="20"/>
-          <w:szCs w:val="20"/>
-          <w:shd w:val="clear" w:color="auto" w:fill="F4F4F4"/>
-        </w:rPr>
-        <w:t>millis()</w:t>
-      </w:r>
-      <w:r>
-        <w:t xml:space="preserve"> timing and a line-buffered receiver work, and why they are needed.</w:t>
-      </w:r>
-    </w:p>
-    <w:p>
-      <w:pPr>
-        <w:pStyle w:val="ListParagraph"/>
-        <w:numPr>
-          <w:ilvl w:val="0"/>
-          <w:numId w:val="1"/>
-        </w:numPr>
-        <w:spacing w:after="60" w:line="264" w:lineRule="auto"/>
-      </w:pPr>
-      <w:r>
-        <w:t>Use a hash to check message integrity, and explain what a hash can and cannot protect against.</w:t>
-      </w:r>
-    </w:p>
-    <w:p>
-      <w:pPr>
-        <w:spacing w:after="120"/>
-        <w:rPr>
-          <w:sz w:val="8"/>
-        </w:rPr>
-      </w:pPr>
     </w:p>
     <w:p>
       <w:pPr>
@@ -1842,2380 +1704,7 @@
           <w:b/>
           <w:bCs/>
         </w:rPr>
-        <w:t>2  How UART works</w:t>
-      </w:r>
-    </w:p>
-    <w:p>
-      <w:pPr>
-        <w:spacing w:after="60" w:line="264" w:lineRule="auto"/>
-      </w:pPr>
-      <w:r>
-        <w:t xml:space="preserve">When the line is idle, the transmitter holds it </w:t>
-      </w:r>
-      <w:r>
-        <w:rPr>
-          <w:b/>
-          <w:bCs/>
-        </w:rPr>
-        <w:t>high (1)</w:t>
-      </w:r>
-      <w:r>
-        <w:t>. To send a byte it:</w:t>
-      </w:r>
-    </w:p>
-    <w:p>
-      <w:pPr>
-        <w:pStyle w:val="ListParagraph"/>
-        <w:numPr>
-          <w:ilvl w:val="0"/>
-          <w:numId w:val="3"/>
-        </w:numPr>
-        <w:spacing w:after="60" w:line="264" w:lineRule="auto"/>
-      </w:pPr>
-      <w:r>
-        <w:t xml:space="preserve">Pulls the line </w:t>
-      </w:r>
-      <w:r>
-        <w:rPr>
-          <w:b/>
-          <w:bCs/>
-        </w:rPr>
-        <w:t>low</w:t>
-      </w:r>
-      <w:r>
-        <w:t xml:space="preserve"> for one bit time. This is the </w:t>
-      </w:r>
-      <w:r>
-        <w:rPr>
-          <w:b/>
-          <w:bCs/>
-        </w:rPr>
-        <w:t>start bit</w:t>
-      </w:r>
-      <w:r>
-        <w:t>, and it tells the receiver “a byte is coming, start your timer now”.</w:t>
-      </w:r>
-    </w:p>
-    <w:p>
-      <w:pPr>
-        <w:pStyle w:val="ListParagraph"/>
-        <w:numPr>
-          <w:ilvl w:val="0"/>
-          <w:numId w:val="3"/>
-        </w:numPr>
-        <w:spacing w:after="60" w:line="264" w:lineRule="auto"/>
-      </w:pPr>
-      <w:r>
-        <w:t xml:space="preserve">Sends the 8 </w:t>
-      </w:r>
-      <w:r>
-        <w:rPr>
-          <w:b/>
-          <w:bCs/>
-        </w:rPr>
-        <w:t>data bits</w:t>
-      </w:r>
-      <w:r>
-        <w:t>, least-significant bit first.</w:t>
-      </w:r>
-    </w:p>
-    <w:p>
-      <w:pPr>
-        <w:pStyle w:val="ListParagraph"/>
-        <w:numPr>
-          <w:ilvl w:val="0"/>
-          <w:numId w:val="3"/>
-        </w:numPr>
-        <w:spacing w:after="60" w:line="264" w:lineRule="auto"/>
-      </w:pPr>
-      <w:r>
-        <w:t xml:space="preserve">Returns the line high for one bit time. This is the </w:t>
-      </w:r>
-      <w:r>
-        <w:rPr>
-          <w:b/>
-          <w:bCs/>
-        </w:rPr>
-        <w:t>stop bit</w:t>
-      </w:r>
-      <w:r>
-        <w:t>, which marks the end of the frame.</w:t>
-      </w:r>
-    </w:p>
-    <w:p>
-      <w:pPr>
-        <w:spacing w:after="60"/>
-        <w:rPr>
-          <w:sz w:val="8"/>
-        </w:rPr>
-      </w:pPr>
-    </w:p>
-    <w:p>
-      <w:pPr>
-        <w:keepNext/>
-        <w:spacing w:after="40" w:line="264" w:lineRule="auto"/>
-      </w:pPr>
-      <w:r>
-        <w:rPr>
-          <w:b/>
-          <w:bCs/>
-          <w:color w:val="595959"/>
-          <w:sz w:val="18"/>
-          <w:szCs w:val="18"/>
-        </w:rPr>
-        <w:lastRenderedPageBreak/>
-        <w:t>One UART frame: sending 'A' (0x41 = 0100 0001), least-significant bit first</w:t>
-      </w:r>
-    </w:p>
-    <w:tbl>
-      <w:tblPr>
-        <w:tblW w:w="9696" w:type="dxa"/>
-        <w:tblLayout w:type="fixed"/>
-        <w:tblLook w:val="04A0" w:firstRow="1" w:lastRow="0" w:firstColumn="1" w:lastColumn="0" w:noHBand="0" w:noVBand="1"/>
-      </w:tblPr>
-      <w:tblGrid>
-        <w:gridCol w:w="808"/>
-        <w:gridCol w:w="808"/>
-        <w:gridCol w:w="808"/>
-        <w:gridCol w:w="808"/>
-        <w:gridCol w:w="808"/>
-        <w:gridCol w:w="808"/>
-        <w:gridCol w:w="808"/>
-        <w:gridCol w:w="808"/>
-        <w:gridCol w:w="808"/>
-        <w:gridCol w:w="808"/>
-        <w:gridCol w:w="808"/>
-        <w:gridCol w:w="808"/>
-      </w:tblGrid>
-      <w:tr>
-        <w:trPr>
-          <w:cantSplit/>
-        </w:trPr>
-        <w:tc>
-          <w:tcPr>
-            <w:tcW w:w="808" w:type="dxa"/>
-            <w:tcMar>
-              <w:top w:w="20" w:type="dxa"/>
-              <w:left w:w="20" w:type="dxa"/>
-              <w:bottom w:w="20" w:type="dxa"/>
-              <w:right w:w="20" w:type="dxa"/>
-            </w:tcMar>
-          </w:tcPr>
-          <w:p>
-            <w:pPr>
-              <w:keepNext/>
-              <w:spacing w:line="264" w:lineRule="auto"/>
-              <w:jc w:val="center"/>
-            </w:pPr>
-            <w:r>
-              <w:rPr>
-                <w:b/>
-                <w:bCs/>
-                <w:color w:val="595959"/>
-                <w:sz w:val="16"/>
-                <w:szCs w:val="16"/>
-              </w:rPr>
-              <w:t>idle</w:t>
-            </w:r>
-          </w:p>
-        </w:tc>
-        <w:tc>
-          <w:tcPr>
-            <w:tcW w:w="808" w:type="dxa"/>
-            <w:tcMar>
-              <w:top w:w="20" w:type="dxa"/>
-              <w:left w:w="20" w:type="dxa"/>
-              <w:bottom w:w="20" w:type="dxa"/>
-              <w:right w:w="20" w:type="dxa"/>
-            </w:tcMar>
-          </w:tcPr>
-          <w:p>
-            <w:pPr>
-              <w:keepNext/>
-              <w:spacing w:line="264" w:lineRule="auto"/>
-              <w:jc w:val="center"/>
-            </w:pPr>
-            <w:r>
-              <w:rPr>
-                <w:b/>
-                <w:bCs/>
-                <w:color w:val="595959"/>
-                <w:sz w:val="16"/>
-                <w:szCs w:val="16"/>
-              </w:rPr>
-              <w:t>Start</w:t>
-            </w:r>
-          </w:p>
-        </w:tc>
-        <w:tc>
-          <w:tcPr>
-            <w:tcW w:w="808" w:type="dxa"/>
-            <w:tcMar>
-              <w:top w:w="20" w:type="dxa"/>
-              <w:left w:w="20" w:type="dxa"/>
-              <w:bottom w:w="20" w:type="dxa"/>
-              <w:right w:w="20" w:type="dxa"/>
-            </w:tcMar>
-          </w:tcPr>
-          <w:p>
-            <w:pPr>
-              <w:keepNext/>
-              <w:spacing w:line="264" w:lineRule="auto"/>
-              <w:jc w:val="center"/>
-            </w:pPr>
-            <w:r>
-              <w:rPr>
-                <w:b/>
-                <w:bCs/>
-                <w:color w:val="595959"/>
-                <w:sz w:val="16"/>
-                <w:szCs w:val="16"/>
-              </w:rPr>
-              <w:t>D0</w:t>
-            </w:r>
-          </w:p>
-        </w:tc>
-        <w:tc>
-          <w:tcPr>
-            <w:tcW w:w="808" w:type="dxa"/>
-            <w:tcMar>
-              <w:top w:w="20" w:type="dxa"/>
-              <w:left w:w="20" w:type="dxa"/>
-              <w:bottom w:w="20" w:type="dxa"/>
-              <w:right w:w="20" w:type="dxa"/>
-            </w:tcMar>
-          </w:tcPr>
-          <w:p>
-            <w:pPr>
-              <w:keepNext/>
-              <w:spacing w:line="264" w:lineRule="auto"/>
-              <w:jc w:val="center"/>
-            </w:pPr>
-            <w:r>
-              <w:rPr>
-                <w:b/>
-                <w:bCs/>
-                <w:color w:val="595959"/>
-                <w:sz w:val="16"/>
-                <w:szCs w:val="16"/>
-              </w:rPr>
-              <w:t>D1</w:t>
-            </w:r>
-          </w:p>
-        </w:tc>
-        <w:tc>
-          <w:tcPr>
-            <w:tcW w:w="808" w:type="dxa"/>
-            <w:tcMar>
-              <w:top w:w="20" w:type="dxa"/>
-              <w:left w:w="20" w:type="dxa"/>
-              <w:bottom w:w="20" w:type="dxa"/>
-              <w:right w:w="20" w:type="dxa"/>
-            </w:tcMar>
-          </w:tcPr>
-          <w:p>
-            <w:pPr>
-              <w:keepNext/>
-              <w:spacing w:line="264" w:lineRule="auto"/>
-              <w:jc w:val="center"/>
-            </w:pPr>
-            <w:r>
-              <w:rPr>
-                <w:b/>
-                <w:bCs/>
-                <w:color w:val="595959"/>
-                <w:sz w:val="16"/>
-                <w:szCs w:val="16"/>
-              </w:rPr>
-              <w:t>D2</w:t>
-            </w:r>
-          </w:p>
-        </w:tc>
-        <w:tc>
-          <w:tcPr>
-            <w:tcW w:w="808" w:type="dxa"/>
-            <w:tcMar>
-              <w:top w:w="20" w:type="dxa"/>
-              <w:left w:w="20" w:type="dxa"/>
-              <w:bottom w:w="20" w:type="dxa"/>
-              <w:right w:w="20" w:type="dxa"/>
-            </w:tcMar>
-          </w:tcPr>
-          <w:p>
-            <w:pPr>
-              <w:keepNext/>
-              <w:spacing w:line="264" w:lineRule="auto"/>
-              <w:jc w:val="center"/>
-            </w:pPr>
-            <w:r>
-              <w:rPr>
-                <w:b/>
-                <w:bCs/>
-                <w:color w:val="595959"/>
-                <w:sz w:val="16"/>
-                <w:szCs w:val="16"/>
-              </w:rPr>
-              <w:t>D3</w:t>
-            </w:r>
-          </w:p>
-        </w:tc>
-        <w:tc>
-          <w:tcPr>
-            <w:tcW w:w="808" w:type="dxa"/>
-            <w:tcMar>
-              <w:top w:w="20" w:type="dxa"/>
-              <w:left w:w="20" w:type="dxa"/>
-              <w:bottom w:w="20" w:type="dxa"/>
-              <w:right w:w="20" w:type="dxa"/>
-            </w:tcMar>
-          </w:tcPr>
-          <w:p>
-            <w:pPr>
-              <w:keepNext/>
-              <w:spacing w:line="264" w:lineRule="auto"/>
-              <w:jc w:val="center"/>
-            </w:pPr>
-            <w:r>
-              <w:rPr>
-                <w:b/>
-                <w:bCs/>
-                <w:color w:val="595959"/>
-                <w:sz w:val="16"/>
-                <w:szCs w:val="16"/>
-              </w:rPr>
-              <w:t>D4</w:t>
-            </w:r>
-          </w:p>
-        </w:tc>
-        <w:tc>
-          <w:tcPr>
-            <w:tcW w:w="808" w:type="dxa"/>
-            <w:tcMar>
-              <w:top w:w="20" w:type="dxa"/>
-              <w:left w:w="20" w:type="dxa"/>
-              <w:bottom w:w="20" w:type="dxa"/>
-              <w:right w:w="20" w:type="dxa"/>
-            </w:tcMar>
-          </w:tcPr>
-          <w:p>
-            <w:pPr>
-              <w:keepNext/>
-              <w:spacing w:line="264" w:lineRule="auto"/>
-              <w:jc w:val="center"/>
-            </w:pPr>
-            <w:r>
-              <w:rPr>
-                <w:b/>
-                <w:bCs/>
-                <w:color w:val="595959"/>
-                <w:sz w:val="16"/>
-                <w:szCs w:val="16"/>
-              </w:rPr>
-              <w:t>D5</w:t>
-            </w:r>
-          </w:p>
-        </w:tc>
-        <w:tc>
-          <w:tcPr>
-            <w:tcW w:w="808" w:type="dxa"/>
-            <w:tcMar>
-              <w:top w:w="20" w:type="dxa"/>
-              <w:left w:w="20" w:type="dxa"/>
-              <w:bottom w:w="20" w:type="dxa"/>
-              <w:right w:w="20" w:type="dxa"/>
-            </w:tcMar>
-          </w:tcPr>
-          <w:p>
-            <w:pPr>
-              <w:keepNext/>
-              <w:spacing w:line="264" w:lineRule="auto"/>
-              <w:jc w:val="center"/>
-            </w:pPr>
-            <w:r>
-              <w:rPr>
-                <w:b/>
-                <w:bCs/>
-                <w:color w:val="595959"/>
-                <w:sz w:val="16"/>
-                <w:szCs w:val="16"/>
-              </w:rPr>
-              <w:t>D6</w:t>
-            </w:r>
-          </w:p>
-        </w:tc>
-        <w:tc>
-          <w:tcPr>
-            <w:tcW w:w="808" w:type="dxa"/>
-            <w:tcMar>
-              <w:top w:w="20" w:type="dxa"/>
-              <w:left w:w="20" w:type="dxa"/>
-              <w:bottom w:w="20" w:type="dxa"/>
-              <w:right w:w="20" w:type="dxa"/>
-            </w:tcMar>
-          </w:tcPr>
-          <w:p>
-            <w:pPr>
-              <w:keepNext/>
-              <w:spacing w:line="264" w:lineRule="auto"/>
-              <w:jc w:val="center"/>
-            </w:pPr>
-            <w:r>
-              <w:rPr>
-                <w:b/>
-                <w:bCs/>
-                <w:color w:val="595959"/>
-                <w:sz w:val="16"/>
-                <w:szCs w:val="16"/>
-              </w:rPr>
-              <w:t>D7</w:t>
-            </w:r>
-          </w:p>
-        </w:tc>
-        <w:tc>
-          <w:tcPr>
-            <w:tcW w:w="808" w:type="dxa"/>
-            <w:tcMar>
-              <w:top w:w="20" w:type="dxa"/>
-              <w:left w:w="20" w:type="dxa"/>
-              <w:bottom w:w="20" w:type="dxa"/>
-              <w:right w:w="20" w:type="dxa"/>
-            </w:tcMar>
-          </w:tcPr>
-          <w:p>
-            <w:pPr>
-              <w:keepNext/>
-              <w:spacing w:line="264" w:lineRule="auto"/>
-              <w:jc w:val="center"/>
-            </w:pPr>
-            <w:r>
-              <w:rPr>
-                <w:b/>
-                <w:bCs/>
-                <w:color w:val="595959"/>
-                <w:sz w:val="16"/>
-                <w:szCs w:val="16"/>
-              </w:rPr>
-              <w:t>Stop</w:t>
-            </w:r>
-          </w:p>
-        </w:tc>
-        <w:tc>
-          <w:tcPr>
-            <w:tcW w:w="808" w:type="dxa"/>
-            <w:tcMar>
-              <w:top w:w="20" w:type="dxa"/>
-              <w:left w:w="20" w:type="dxa"/>
-              <w:bottom w:w="20" w:type="dxa"/>
-              <w:right w:w="20" w:type="dxa"/>
-            </w:tcMar>
-          </w:tcPr>
-          <w:p>
-            <w:pPr>
-              <w:keepNext/>
-              <w:spacing w:line="264" w:lineRule="auto"/>
-              <w:jc w:val="center"/>
-            </w:pPr>
-            <w:r>
-              <w:rPr>
-                <w:b/>
-                <w:bCs/>
-                <w:color w:val="595959"/>
-                <w:sz w:val="16"/>
-                <w:szCs w:val="16"/>
-              </w:rPr>
-              <w:t>idle</w:t>
-            </w:r>
-          </w:p>
-        </w:tc>
-      </w:tr>
-      <w:tr>
-        <w:trPr>
-          <w:cantSplit/>
-        </w:trPr>
-        <w:tc>
-          <w:tcPr>
-            <w:tcW w:w="808" w:type="dxa"/>
-            <w:tcBorders>
-              <w:top w:val="single" w:sz="12" w:space="0" w:color="FFFFFF"/>
-              <w:left w:val="single" w:sz="12" w:space="0" w:color="FFFFFF"/>
-              <w:bottom w:val="single" w:sz="12" w:space="0" w:color="FFFFFF"/>
-              <w:right w:val="single" w:sz="12" w:space="0" w:color="FFFFFF"/>
-            </w:tcBorders>
-            <w:shd w:val="clear" w:color="auto" w:fill="D9D9D9"/>
-            <w:tcMar>
-              <w:top w:w="80" w:type="dxa"/>
-              <w:left w:w="20" w:type="dxa"/>
-              <w:bottom w:w="80" w:type="dxa"/>
-              <w:right w:w="20" w:type="dxa"/>
-            </w:tcMar>
-          </w:tcPr>
-          <w:p>
-            <w:pPr>
-              <w:spacing w:line="264" w:lineRule="auto"/>
-              <w:jc w:val="center"/>
-            </w:pPr>
-            <w:r>
-              <w:rPr>
-                <w:b/>
-                <w:bCs/>
-                <w:color w:val="595959"/>
-                <w:sz w:val="24"/>
-                <w:szCs w:val="24"/>
-              </w:rPr>
-              <w:t>1</w:t>
-            </w:r>
-          </w:p>
-        </w:tc>
-        <w:tc>
-          <w:tcPr>
-            <w:tcW w:w="808" w:type="dxa"/>
-            <w:tcBorders>
-              <w:top w:val="single" w:sz="12" w:space="0" w:color="FFFFFF"/>
-              <w:left w:val="single" w:sz="12" w:space="0" w:color="FFFFFF"/>
-              <w:bottom w:val="single" w:sz="12" w:space="0" w:color="FFFFFF"/>
-              <w:right w:val="single" w:sz="12" w:space="0" w:color="FFFFFF"/>
-            </w:tcBorders>
-            <w:shd w:val="clear" w:color="auto" w:fill="C00000"/>
-            <w:tcMar>
-              <w:top w:w="80" w:type="dxa"/>
-              <w:left w:w="20" w:type="dxa"/>
-              <w:bottom w:w="80" w:type="dxa"/>
-              <w:right w:w="20" w:type="dxa"/>
-            </w:tcMar>
-          </w:tcPr>
-          <w:p>
-            <w:pPr>
-              <w:spacing w:line="264" w:lineRule="auto"/>
-              <w:jc w:val="center"/>
-            </w:pPr>
-            <w:r>
-              <w:rPr>
-                <w:b/>
-                <w:bCs/>
-                <w:color w:val="FFFFFF"/>
-                <w:sz w:val="24"/>
-                <w:szCs w:val="24"/>
-              </w:rPr>
-              <w:t>0</w:t>
-            </w:r>
-          </w:p>
-        </w:tc>
-        <w:tc>
-          <w:tcPr>
-            <w:tcW w:w="808" w:type="dxa"/>
-            <w:tcBorders>
-              <w:top w:val="single" w:sz="12" w:space="0" w:color="FFFFFF"/>
-              <w:left w:val="single" w:sz="12" w:space="0" w:color="FFFFFF"/>
-              <w:bottom w:val="single" w:sz="12" w:space="0" w:color="FFFFFF"/>
-              <w:right w:val="single" w:sz="12" w:space="0" w:color="FFFFFF"/>
-            </w:tcBorders>
-            <w:shd w:val="clear" w:color="auto" w:fill="2E75B6"/>
-            <w:tcMar>
-              <w:top w:w="80" w:type="dxa"/>
-              <w:left w:w="20" w:type="dxa"/>
-              <w:bottom w:w="80" w:type="dxa"/>
-              <w:right w:w="20" w:type="dxa"/>
-            </w:tcMar>
-          </w:tcPr>
-          <w:p>
-            <w:pPr>
-              <w:spacing w:line="264" w:lineRule="auto"/>
-              <w:jc w:val="center"/>
-            </w:pPr>
-            <w:r>
-              <w:rPr>
-                <w:b/>
-                <w:bCs/>
-                <w:color w:val="FFFFFF"/>
-                <w:sz w:val="24"/>
-                <w:szCs w:val="24"/>
-              </w:rPr>
-              <w:t>1</w:t>
-            </w:r>
-          </w:p>
-        </w:tc>
-        <w:tc>
-          <w:tcPr>
-            <w:tcW w:w="808" w:type="dxa"/>
-            <w:tcBorders>
-              <w:top w:val="single" w:sz="12" w:space="0" w:color="FFFFFF"/>
-              <w:left w:val="single" w:sz="12" w:space="0" w:color="FFFFFF"/>
-              <w:bottom w:val="single" w:sz="12" w:space="0" w:color="FFFFFF"/>
-              <w:right w:val="single" w:sz="12" w:space="0" w:color="FFFFFF"/>
-            </w:tcBorders>
-            <w:shd w:val="clear" w:color="auto" w:fill="2E75B6"/>
-            <w:tcMar>
-              <w:top w:w="80" w:type="dxa"/>
-              <w:left w:w="20" w:type="dxa"/>
-              <w:bottom w:w="80" w:type="dxa"/>
-              <w:right w:w="20" w:type="dxa"/>
-            </w:tcMar>
-          </w:tcPr>
-          <w:p>
-            <w:pPr>
-              <w:spacing w:line="264" w:lineRule="auto"/>
-              <w:jc w:val="center"/>
-            </w:pPr>
-            <w:r>
-              <w:rPr>
-                <w:b/>
-                <w:bCs/>
-                <w:color w:val="FFFFFF"/>
-                <w:sz w:val="24"/>
-                <w:szCs w:val="24"/>
-              </w:rPr>
-              <w:t>0</w:t>
-            </w:r>
-          </w:p>
-        </w:tc>
-        <w:tc>
-          <w:tcPr>
-            <w:tcW w:w="808" w:type="dxa"/>
-            <w:tcBorders>
-              <w:top w:val="single" w:sz="12" w:space="0" w:color="FFFFFF"/>
-              <w:left w:val="single" w:sz="12" w:space="0" w:color="FFFFFF"/>
-              <w:bottom w:val="single" w:sz="12" w:space="0" w:color="FFFFFF"/>
-              <w:right w:val="single" w:sz="12" w:space="0" w:color="FFFFFF"/>
-            </w:tcBorders>
-            <w:shd w:val="clear" w:color="auto" w:fill="2E75B6"/>
-            <w:tcMar>
-              <w:top w:w="80" w:type="dxa"/>
-              <w:left w:w="20" w:type="dxa"/>
-              <w:bottom w:w="80" w:type="dxa"/>
-              <w:right w:w="20" w:type="dxa"/>
-            </w:tcMar>
-          </w:tcPr>
-          <w:p>
-            <w:pPr>
-              <w:spacing w:line="264" w:lineRule="auto"/>
-              <w:jc w:val="center"/>
-            </w:pPr>
-            <w:r>
-              <w:rPr>
-                <w:b/>
-                <w:bCs/>
-                <w:color w:val="FFFFFF"/>
-                <w:sz w:val="24"/>
-                <w:szCs w:val="24"/>
-              </w:rPr>
-              <w:t>0</w:t>
-            </w:r>
-          </w:p>
-        </w:tc>
-        <w:tc>
-          <w:tcPr>
-            <w:tcW w:w="808" w:type="dxa"/>
-            <w:tcBorders>
-              <w:top w:val="single" w:sz="12" w:space="0" w:color="FFFFFF"/>
-              <w:left w:val="single" w:sz="12" w:space="0" w:color="FFFFFF"/>
-              <w:bottom w:val="single" w:sz="12" w:space="0" w:color="FFFFFF"/>
-              <w:right w:val="single" w:sz="12" w:space="0" w:color="FFFFFF"/>
-            </w:tcBorders>
-            <w:shd w:val="clear" w:color="auto" w:fill="2E75B6"/>
-            <w:tcMar>
-              <w:top w:w="80" w:type="dxa"/>
-              <w:left w:w="20" w:type="dxa"/>
-              <w:bottom w:w="80" w:type="dxa"/>
-              <w:right w:w="20" w:type="dxa"/>
-            </w:tcMar>
-          </w:tcPr>
-          <w:p>
-            <w:pPr>
-              <w:spacing w:line="264" w:lineRule="auto"/>
-              <w:jc w:val="center"/>
-            </w:pPr>
-            <w:r>
-              <w:rPr>
-                <w:b/>
-                <w:bCs/>
-                <w:color w:val="FFFFFF"/>
-                <w:sz w:val="24"/>
-                <w:szCs w:val="24"/>
-              </w:rPr>
-              <w:t>0</w:t>
-            </w:r>
-          </w:p>
-        </w:tc>
-        <w:tc>
-          <w:tcPr>
-            <w:tcW w:w="808" w:type="dxa"/>
-            <w:tcBorders>
-              <w:top w:val="single" w:sz="12" w:space="0" w:color="FFFFFF"/>
-              <w:left w:val="single" w:sz="12" w:space="0" w:color="FFFFFF"/>
-              <w:bottom w:val="single" w:sz="12" w:space="0" w:color="FFFFFF"/>
-              <w:right w:val="single" w:sz="12" w:space="0" w:color="FFFFFF"/>
-            </w:tcBorders>
-            <w:shd w:val="clear" w:color="auto" w:fill="2E75B6"/>
-            <w:tcMar>
-              <w:top w:w="80" w:type="dxa"/>
-              <w:left w:w="20" w:type="dxa"/>
-              <w:bottom w:w="80" w:type="dxa"/>
-              <w:right w:w="20" w:type="dxa"/>
-            </w:tcMar>
-          </w:tcPr>
-          <w:p>
-            <w:pPr>
-              <w:spacing w:line="264" w:lineRule="auto"/>
-              <w:jc w:val="center"/>
-            </w:pPr>
-            <w:r>
-              <w:rPr>
-                <w:b/>
-                <w:bCs/>
-                <w:color w:val="FFFFFF"/>
-                <w:sz w:val="24"/>
-                <w:szCs w:val="24"/>
-              </w:rPr>
-              <w:t>0</w:t>
-            </w:r>
-          </w:p>
-        </w:tc>
-        <w:tc>
-          <w:tcPr>
-            <w:tcW w:w="808" w:type="dxa"/>
-            <w:tcBorders>
-              <w:top w:val="single" w:sz="12" w:space="0" w:color="FFFFFF"/>
-              <w:left w:val="single" w:sz="12" w:space="0" w:color="FFFFFF"/>
-              <w:bottom w:val="single" w:sz="12" w:space="0" w:color="FFFFFF"/>
-              <w:right w:val="single" w:sz="12" w:space="0" w:color="FFFFFF"/>
-            </w:tcBorders>
-            <w:shd w:val="clear" w:color="auto" w:fill="2E75B6"/>
-            <w:tcMar>
-              <w:top w:w="80" w:type="dxa"/>
-              <w:left w:w="20" w:type="dxa"/>
-              <w:bottom w:w="80" w:type="dxa"/>
-              <w:right w:w="20" w:type="dxa"/>
-            </w:tcMar>
-          </w:tcPr>
-          <w:p>
-            <w:pPr>
-              <w:spacing w:line="264" w:lineRule="auto"/>
-              <w:jc w:val="center"/>
-            </w:pPr>
-            <w:r>
-              <w:rPr>
-                <w:b/>
-                <w:bCs/>
-                <w:color w:val="FFFFFF"/>
-                <w:sz w:val="24"/>
-                <w:szCs w:val="24"/>
-              </w:rPr>
-              <w:t>0</w:t>
-            </w:r>
-          </w:p>
-        </w:tc>
-        <w:tc>
-          <w:tcPr>
-            <w:tcW w:w="808" w:type="dxa"/>
-            <w:tcBorders>
-              <w:top w:val="single" w:sz="12" w:space="0" w:color="FFFFFF"/>
-              <w:left w:val="single" w:sz="12" w:space="0" w:color="FFFFFF"/>
-              <w:bottom w:val="single" w:sz="12" w:space="0" w:color="FFFFFF"/>
-              <w:right w:val="single" w:sz="12" w:space="0" w:color="FFFFFF"/>
-            </w:tcBorders>
-            <w:shd w:val="clear" w:color="auto" w:fill="2E75B6"/>
-            <w:tcMar>
-              <w:top w:w="80" w:type="dxa"/>
-              <w:left w:w="20" w:type="dxa"/>
-              <w:bottom w:w="80" w:type="dxa"/>
-              <w:right w:w="20" w:type="dxa"/>
-            </w:tcMar>
-          </w:tcPr>
-          <w:p>
-            <w:pPr>
-              <w:spacing w:line="264" w:lineRule="auto"/>
-              <w:jc w:val="center"/>
-            </w:pPr>
-            <w:r>
-              <w:rPr>
-                <w:b/>
-                <w:bCs/>
-                <w:color w:val="FFFFFF"/>
-                <w:sz w:val="24"/>
-                <w:szCs w:val="24"/>
-              </w:rPr>
-              <w:t>1</w:t>
-            </w:r>
-          </w:p>
-        </w:tc>
-        <w:tc>
-          <w:tcPr>
-            <w:tcW w:w="808" w:type="dxa"/>
-            <w:tcBorders>
-              <w:top w:val="single" w:sz="12" w:space="0" w:color="FFFFFF"/>
-              <w:left w:val="single" w:sz="12" w:space="0" w:color="FFFFFF"/>
-              <w:bottom w:val="single" w:sz="12" w:space="0" w:color="FFFFFF"/>
-              <w:right w:val="single" w:sz="12" w:space="0" w:color="FFFFFF"/>
-            </w:tcBorders>
-            <w:shd w:val="clear" w:color="auto" w:fill="2E75B6"/>
-            <w:tcMar>
-              <w:top w:w="80" w:type="dxa"/>
-              <w:left w:w="20" w:type="dxa"/>
-              <w:bottom w:w="80" w:type="dxa"/>
-              <w:right w:w="20" w:type="dxa"/>
-            </w:tcMar>
-          </w:tcPr>
-          <w:p>
-            <w:pPr>
-              <w:spacing w:line="264" w:lineRule="auto"/>
-              <w:jc w:val="center"/>
-            </w:pPr>
-            <w:r>
-              <w:rPr>
-                <w:b/>
-                <w:bCs/>
-                <w:color w:val="FFFFFF"/>
-                <w:sz w:val="24"/>
-                <w:szCs w:val="24"/>
-              </w:rPr>
-              <w:t>0</w:t>
-            </w:r>
-          </w:p>
-        </w:tc>
-        <w:tc>
-          <w:tcPr>
-            <w:tcW w:w="808" w:type="dxa"/>
-            <w:tcBorders>
-              <w:top w:val="single" w:sz="12" w:space="0" w:color="FFFFFF"/>
-              <w:left w:val="single" w:sz="12" w:space="0" w:color="FFFFFF"/>
-              <w:bottom w:val="single" w:sz="12" w:space="0" w:color="FFFFFF"/>
-              <w:right w:val="single" w:sz="12" w:space="0" w:color="FFFFFF"/>
-            </w:tcBorders>
-            <w:shd w:val="clear" w:color="auto" w:fill="548235"/>
-            <w:tcMar>
-              <w:top w:w="80" w:type="dxa"/>
-              <w:left w:w="20" w:type="dxa"/>
-              <w:bottom w:w="80" w:type="dxa"/>
-              <w:right w:w="20" w:type="dxa"/>
-            </w:tcMar>
-          </w:tcPr>
-          <w:p>
-            <w:pPr>
-              <w:spacing w:line="264" w:lineRule="auto"/>
-              <w:jc w:val="center"/>
-            </w:pPr>
-            <w:r>
-              <w:rPr>
-                <w:b/>
-                <w:bCs/>
-                <w:color w:val="FFFFFF"/>
-                <w:sz w:val="24"/>
-                <w:szCs w:val="24"/>
-              </w:rPr>
-              <w:t>1</w:t>
-            </w:r>
-          </w:p>
-        </w:tc>
-        <w:tc>
-          <w:tcPr>
-            <w:tcW w:w="808" w:type="dxa"/>
-            <w:tcBorders>
-              <w:top w:val="single" w:sz="12" w:space="0" w:color="FFFFFF"/>
-              <w:left w:val="single" w:sz="12" w:space="0" w:color="FFFFFF"/>
-              <w:bottom w:val="single" w:sz="12" w:space="0" w:color="FFFFFF"/>
-              <w:right w:val="single" w:sz="12" w:space="0" w:color="FFFFFF"/>
-            </w:tcBorders>
-            <w:shd w:val="clear" w:color="auto" w:fill="D9D9D9"/>
-            <w:tcMar>
-              <w:top w:w="80" w:type="dxa"/>
-              <w:left w:w="20" w:type="dxa"/>
-              <w:bottom w:w="80" w:type="dxa"/>
-              <w:right w:w="20" w:type="dxa"/>
-            </w:tcMar>
-          </w:tcPr>
-          <w:p>
-            <w:pPr>
-              <w:spacing w:line="264" w:lineRule="auto"/>
-              <w:jc w:val="center"/>
-            </w:pPr>
-            <w:r>
-              <w:rPr>
-                <w:b/>
-                <w:bCs/>
-                <w:color w:val="595959"/>
-                <w:sz w:val="24"/>
-                <w:szCs w:val="24"/>
-              </w:rPr>
-              <w:t>1</w:t>
-            </w:r>
-          </w:p>
-        </w:tc>
-      </w:tr>
-    </w:tbl>
-    <w:p>
-      <w:pPr>
-        <w:spacing w:after="160" w:line="264" w:lineRule="auto"/>
-      </w:pPr>
-      <w:r>
-        <w:rPr>
-          <w:color w:val="595959"/>
-          <w:sz w:val="18"/>
-          <w:szCs w:val="18"/>
-        </w:rPr>
-        <w:t xml:space="preserve">Time →   each box lasts 1/9600 s ≈ </w:t>
-      </w:r>
-      <w:r>
-        <w:rPr>
-          <w:b/>
-          <w:bCs/>
-          <w:color w:val="595959"/>
-          <w:sz w:val="18"/>
-          <w:szCs w:val="18"/>
-        </w:rPr>
-        <w:t>104 µs</w:t>
-      </w:r>
-      <w:r>
-        <w:rPr>
-          <w:color w:val="595959"/>
-          <w:sz w:val="18"/>
-          <w:szCs w:val="18"/>
-        </w:rPr>
-        <w:t xml:space="preserve"> at 9600 baud, so one 10-bit frame takes about </w:t>
-      </w:r>
-      <w:r>
-        <w:rPr>
-          <w:b/>
-          <w:bCs/>
-          <w:color w:val="595959"/>
-          <w:sz w:val="18"/>
-          <w:szCs w:val="18"/>
-        </w:rPr>
-        <w:t>1.04 ms</w:t>
-      </w:r>
-      <w:r>
-        <w:rPr>
-          <w:color w:val="595959"/>
-          <w:sz w:val="18"/>
-          <w:szCs w:val="18"/>
-        </w:rPr>
-        <w:t>.</w:t>
-      </w:r>
-    </w:p>
-    <w:p>
-      <w:pPr>
-        <w:spacing w:after="60" w:line="264" w:lineRule="auto"/>
-      </w:pPr>
-      <w:r>
-        <w:t xml:space="preserve">Because there is no clock wire, the receiver samples the line at the times it </w:t>
-      </w:r>
-      <w:r>
-        <w:rPr>
-          <w:i/>
-          <w:iCs/>
-        </w:rPr>
-        <w:t>expects</w:t>
-      </w:r>
-      <w:r>
-        <w:t xml:space="preserve"> each bit to arrive. That only works if:</w:t>
-      </w:r>
-    </w:p>
-    <w:p>
-      <w:pPr>
-        <w:pStyle w:val="ListParagraph"/>
-        <w:numPr>
-          <w:ilvl w:val="0"/>
-          <w:numId w:val="1"/>
-        </w:numPr>
-        <w:spacing w:after="60" w:line="264" w:lineRule="auto"/>
-      </w:pPr>
-      <w:r>
-        <w:rPr>
-          <w:b/>
-          <w:bCs/>
-        </w:rPr>
-        <w:t>Both sides use the same baud rate.</w:t>
-      </w:r>
-      <w:r>
-        <w:t xml:space="preserve"> At the wrong rate the receiver samples the wrong bits and you see garbage.</w:t>
-      </w:r>
-    </w:p>
-    <w:p>
-      <w:pPr>
-        <w:pStyle w:val="ListParagraph"/>
-        <w:numPr>
-          <w:ilvl w:val="0"/>
-          <w:numId w:val="1"/>
-        </w:numPr>
-        <w:spacing w:after="60" w:line="264" w:lineRule="auto"/>
-      </w:pPr>
-      <w:r>
-        <w:rPr>
-          <w:b/>
-          <w:bCs/>
-        </w:rPr>
-        <w:t>TX goes to RX.</w:t>
-      </w:r>
-      <w:r>
-        <w:t xml:space="preserve"> One board’s transmit pin must drive the other board’s receive pin, so the wires cross over.</w:t>
-      </w:r>
-    </w:p>
-    <w:p>
-      <w:pPr>
-        <w:pStyle w:val="ListParagraph"/>
-        <w:numPr>
-          <w:ilvl w:val="0"/>
-          <w:numId w:val="1"/>
-        </w:numPr>
-        <w:spacing w:after="60" w:line="264" w:lineRule="auto"/>
-      </w:pPr>
-      <w:r>
-        <w:rPr>
-          <w:b/>
-          <w:bCs/>
-        </w:rPr>
-        <w:t>The grounds are connected.</w:t>
-      </w:r>
-      <w:r>
-        <w:t xml:space="preserve"> A “high” or “low” voltage only means something relative to a shared 0 V reference.</w:t>
-      </w:r>
-    </w:p>
-    <w:p>
-      <w:pPr>
-        <w:spacing w:after="120"/>
-        <w:rPr>
-          <w:sz w:val="8"/>
-        </w:rPr>
-      </w:pPr>
-    </w:p>
-    <w:p>
-      <w:pPr>
-        <w:pStyle w:val="Heading2"/>
-        <w:keepNext/>
-        <w:spacing w:before="240" w:after="80"/>
-      </w:pPr>
-      <w:r>
-        <w:rPr>
-          <w:b/>
-          <w:bCs/>
-        </w:rPr>
-        <w:t>Hardware UART vs SoftwareSerial</w:t>
-      </w:r>
-    </w:p>
-    <w:tbl>
-      <w:tblPr>
-        <w:tblW w:w="9706" w:type="dxa"/>
-        <w:tblBorders>
-          <w:top w:val="single" w:sz="4" w:space="0" w:color="BFBFBF"/>
-          <w:left w:val="single" w:sz="4" w:space="0" w:color="BFBFBF"/>
-          <w:bottom w:val="single" w:sz="4" w:space="0" w:color="BFBFBF"/>
-          <w:right w:val="single" w:sz="4" w:space="0" w:color="BFBFBF"/>
-          <w:insideH w:val="single" w:sz="4" w:space="0" w:color="BFBFBF"/>
-          <w:insideV w:val="single" w:sz="4" w:space="0" w:color="BFBFBF"/>
-        </w:tblBorders>
-        <w:tblLayout w:type="fixed"/>
-        <w:tblLook w:val="04A0" w:firstRow="1" w:lastRow="0" w:firstColumn="1" w:lastColumn="0" w:noHBand="0" w:noVBand="1"/>
-      </w:tblPr>
-      <w:tblGrid>
-        <w:gridCol w:w="2300"/>
-        <w:gridCol w:w="3700"/>
-        <w:gridCol w:w="3706"/>
-      </w:tblGrid>
-      <w:tr>
-        <w:trPr>
-          <w:cantSplit/>
-          <w:tblHeader/>
-        </w:trPr>
-        <w:tc>
-          <w:tcPr>
-            <w:tcW w:w="2300" w:type="dxa"/>
-            <w:shd w:val="clear" w:color="auto" w:fill="2E74B5"/>
-            <w:tcMar>
-              <w:top w:w="60" w:type="dxa"/>
-              <w:left w:w="100" w:type="dxa"/>
-              <w:bottom w:w="60" w:type="dxa"/>
-              <w:right w:w="100" w:type="dxa"/>
-            </w:tcMar>
-          </w:tcPr>
-          <w:p>
-            <w:pPr>
-              <w:spacing w:line="264" w:lineRule="auto"/>
-            </w:pPr>
-          </w:p>
-        </w:tc>
-        <w:tc>
-          <w:tcPr>
-            <w:tcW w:w="3700" w:type="dxa"/>
-            <w:shd w:val="clear" w:color="auto" w:fill="2E74B5"/>
-            <w:tcMar>
-              <w:top w:w="60" w:type="dxa"/>
-              <w:left w:w="100" w:type="dxa"/>
-              <w:bottom w:w="60" w:type="dxa"/>
-              <w:right w:w="100" w:type="dxa"/>
-            </w:tcMar>
-          </w:tcPr>
-          <w:p>
-            <w:pPr>
-              <w:spacing w:line="264" w:lineRule="auto"/>
-            </w:pPr>
-            <w:r>
-              <w:rPr>
-                <w:b/>
-                <w:bCs/>
-                <w:color w:val="FFFFFF"/>
-                <w:sz w:val="19"/>
-                <w:szCs w:val="19"/>
-              </w:rPr>
-              <w:t>Hardware UART (Serial / Serial1)</w:t>
-            </w:r>
-          </w:p>
-        </w:tc>
-        <w:tc>
-          <w:tcPr>
-            <w:tcW w:w="3706" w:type="dxa"/>
-            <w:shd w:val="clear" w:color="auto" w:fill="2E74B5"/>
-            <w:tcMar>
-              <w:top w:w="60" w:type="dxa"/>
-              <w:left w:w="100" w:type="dxa"/>
-              <w:bottom w:w="60" w:type="dxa"/>
-              <w:right w:w="100" w:type="dxa"/>
-            </w:tcMar>
-          </w:tcPr>
-          <w:p>
-            <w:pPr>
-              <w:spacing w:line="264" w:lineRule="auto"/>
-            </w:pPr>
-            <w:r>
-              <w:rPr>
-                <w:b/>
-                <w:bCs/>
-                <w:color w:val="FFFFFF"/>
-                <w:sz w:val="19"/>
-                <w:szCs w:val="19"/>
-              </w:rPr>
-              <w:t>SoftwareSerial</w:t>
-            </w:r>
-          </w:p>
-        </w:tc>
-      </w:tr>
-      <w:tr>
-        <w:trPr>
-          <w:cantSplit/>
-        </w:trPr>
-        <w:tc>
-          <w:tcPr>
-            <w:tcW w:w="2300" w:type="dxa"/>
-            <w:tcMar>
-              <w:top w:w="60" w:type="dxa"/>
-              <w:left w:w="100" w:type="dxa"/>
-              <w:bottom w:w="60" w:type="dxa"/>
-              <w:right w:w="100" w:type="dxa"/>
-            </w:tcMar>
-          </w:tcPr>
-          <w:p>
-            <w:pPr>
-              <w:spacing w:line="264" w:lineRule="auto"/>
-            </w:pPr>
-            <w:r>
-              <w:rPr>
-                <w:sz w:val="19"/>
-                <w:szCs w:val="19"/>
-              </w:rPr>
-              <w:t>Pins</w:t>
-            </w:r>
-          </w:p>
-        </w:tc>
-        <w:tc>
-          <w:tcPr>
-            <w:tcW w:w="3700" w:type="dxa"/>
-            <w:tcMar>
-              <w:top w:w="60" w:type="dxa"/>
-              <w:left w:w="100" w:type="dxa"/>
-              <w:bottom w:w="60" w:type="dxa"/>
-              <w:right w:w="100" w:type="dxa"/>
-            </w:tcMar>
-          </w:tcPr>
-          <w:p>
-            <w:pPr>
-              <w:spacing w:line="264" w:lineRule="auto"/>
-            </w:pPr>
-            <w:r>
-              <w:rPr>
-                <w:sz w:val="19"/>
-                <w:szCs w:val="19"/>
-              </w:rPr>
-              <w:t>Fixed: D0 (RX), D1 (TX)</w:t>
-            </w:r>
-          </w:p>
-        </w:tc>
-        <w:tc>
-          <w:tcPr>
-            <w:tcW w:w="3706" w:type="dxa"/>
-            <w:tcMar>
-              <w:top w:w="60" w:type="dxa"/>
-              <w:left w:w="100" w:type="dxa"/>
-              <w:bottom w:w="60" w:type="dxa"/>
-              <w:right w:w="100" w:type="dxa"/>
-            </w:tcMar>
-          </w:tcPr>
-          <w:p>
-            <w:pPr>
-              <w:spacing w:line="264" w:lineRule="auto"/>
-            </w:pPr>
-            <w:r>
-              <w:rPr>
-                <w:sz w:val="19"/>
-                <w:szCs w:val="19"/>
-              </w:rPr>
-              <w:t>Almost any pins, here D10 (RX) and D11 (TX)</w:t>
-            </w:r>
-          </w:p>
-        </w:tc>
-      </w:tr>
-      <w:tr>
-        <w:trPr>
-          <w:cantSplit/>
-        </w:trPr>
-        <w:tc>
-          <w:tcPr>
-            <w:tcW w:w="2300" w:type="dxa"/>
-            <w:shd w:val="clear" w:color="auto" w:fill="F3F7FB"/>
-            <w:tcMar>
-              <w:top w:w="60" w:type="dxa"/>
-              <w:left w:w="100" w:type="dxa"/>
-              <w:bottom w:w="60" w:type="dxa"/>
-              <w:right w:w="100" w:type="dxa"/>
-            </w:tcMar>
-          </w:tcPr>
-          <w:p>
-            <w:pPr>
-              <w:spacing w:line="264" w:lineRule="auto"/>
-            </w:pPr>
-            <w:r>
-              <w:rPr>
-                <w:sz w:val="19"/>
-                <w:szCs w:val="19"/>
-              </w:rPr>
-              <w:t>How it works</w:t>
-            </w:r>
-          </w:p>
-        </w:tc>
-        <w:tc>
-          <w:tcPr>
-            <w:tcW w:w="3700" w:type="dxa"/>
-            <w:shd w:val="clear" w:color="auto" w:fill="F3F7FB"/>
-            <w:tcMar>
-              <w:top w:w="60" w:type="dxa"/>
-              <w:left w:w="100" w:type="dxa"/>
-              <w:bottom w:w="60" w:type="dxa"/>
-              <w:right w:w="100" w:type="dxa"/>
-            </w:tcMar>
-          </w:tcPr>
-          <w:p>
-            <w:pPr>
-              <w:spacing w:line="264" w:lineRule="auto"/>
-            </w:pPr>
-            <w:r>
-              <w:rPr>
-                <w:sz w:val="19"/>
-                <w:szCs w:val="19"/>
-              </w:rPr>
-              <w:t>Dedicated UART peripheral inside the chip</w:t>
-            </w:r>
-          </w:p>
-        </w:tc>
-        <w:tc>
-          <w:tcPr>
-            <w:tcW w:w="3706" w:type="dxa"/>
-            <w:shd w:val="clear" w:color="auto" w:fill="F3F7FB"/>
-            <w:tcMar>
-              <w:top w:w="60" w:type="dxa"/>
-              <w:left w:w="100" w:type="dxa"/>
-              <w:bottom w:w="60" w:type="dxa"/>
-              <w:right w:w="100" w:type="dxa"/>
-            </w:tcMar>
-          </w:tcPr>
-          <w:p>
-            <w:pPr>
-              <w:spacing w:line="264" w:lineRule="auto"/>
-            </w:pPr>
-            <w:r>
-              <w:rPr>
-                <w:sz w:val="19"/>
-                <w:szCs w:val="19"/>
-              </w:rPr>
-              <w:t>The CPU times each bit in software</w:t>
-            </w:r>
-          </w:p>
-        </w:tc>
-      </w:tr>
-      <w:tr>
-        <w:trPr>
-          <w:cantSplit/>
-        </w:trPr>
-        <w:tc>
-          <w:tcPr>
-            <w:tcW w:w="2300" w:type="dxa"/>
-            <w:tcMar>
-              <w:top w:w="60" w:type="dxa"/>
-              <w:left w:w="100" w:type="dxa"/>
-              <w:bottom w:w="60" w:type="dxa"/>
-              <w:right w:w="100" w:type="dxa"/>
-            </w:tcMar>
-          </w:tcPr>
-          <w:p>
-            <w:pPr>
-              <w:spacing w:line="264" w:lineRule="auto"/>
-            </w:pPr>
-            <w:r>
-              <w:rPr>
-                <w:sz w:val="19"/>
-                <w:szCs w:val="19"/>
-              </w:rPr>
-              <w:t>Send and receive at once</w:t>
-            </w:r>
-          </w:p>
-        </w:tc>
-        <w:tc>
-          <w:tcPr>
-            <w:tcW w:w="3700" w:type="dxa"/>
-            <w:tcMar>
-              <w:top w:w="60" w:type="dxa"/>
-              <w:left w:w="100" w:type="dxa"/>
-              <w:bottom w:w="60" w:type="dxa"/>
-              <w:right w:w="100" w:type="dxa"/>
-            </w:tcMar>
-          </w:tcPr>
-          <w:p>
-            <w:pPr>
-              <w:spacing w:line="264" w:lineRule="auto"/>
-            </w:pPr>
-            <w:r>
-              <w:rPr>
-                <w:sz w:val="19"/>
-                <w:szCs w:val="19"/>
-              </w:rPr>
-              <w:t>Yes (full duplex)</w:t>
-            </w:r>
-          </w:p>
-        </w:tc>
-        <w:tc>
-          <w:tcPr>
-            <w:tcW w:w="3706" w:type="dxa"/>
-            <w:tcMar>
-              <w:top w:w="60" w:type="dxa"/>
-              <w:left w:w="100" w:type="dxa"/>
-              <w:bottom w:w="60" w:type="dxa"/>
-              <w:right w:w="100" w:type="dxa"/>
-            </w:tcMar>
-          </w:tcPr>
-          <w:p>
-            <w:pPr>
-              <w:spacing w:line="264" w:lineRule="auto"/>
-            </w:pPr>
-            <w:r>
-              <w:rPr>
-                <w:b/>
-                <w:bCs/>
-                <w:sz w:val="19"/>
-                <w:szCs w:val="19"/>
-              </w:rPr>
-              <w:t>No.</w:t>
-            </w:r>
-            <w:r>
-              <w:rPr>
-                <w:sz w:val="19"/>
-                <w:szCs w:val="19"/>
-              </w:rPr>
-              <w:t xml:space="preserve"> It cannot receive while it is transmitting.</w:t>
-            </w:r>
-          </w:p>
-        </w:tc>
-      </w:tr>
-      <w:tr>
-        <w:trPr>
-          <w:cantSplit/>
-        </w:trPr>
-        <w:tc>
-          <w:tcPr>
-            <w:tcW w:w="2300" w:type="dxa"/>
-            <w:shd w:val="clear" w:color="auto" w:fill="F3F7FB"/>
-            <w:tcMar>
-              <w:top w:w="60" w:type="dxa"/>
-              <w:left w:w="100" w:type="dxa"/>
-              <w:bottom w:w="60" w:type="dxa"/>
-              <w:right w:w="100" w:type="dxa"/>
-            </w:tcMar>
-          </w:tcPr>
-          <w:p>
-            <w:pPr>
-              <w:spacing w:line="264" w:lineRule="auto"/>
-            </w:pPr>
-            <w:r>
-              <w:rPr>
-                <w:sz w:val="19"/>
-                <w:szCs w:val="19"/>
-              </w:rPr>
-              <w:t>Reliable speeds</w:t>
-            </w:r>
-          </w:p>
-        </w:tc>
-        <w:tc>
-          <w:tcPr>
-            <w:tcW w:w="3700" w:type="dxa"/>
-            <w:shd w:val="clear" w:color="auto" w:fill="F3F7FB"/>
-            <w:tcMar>
-              <w:top w:w="60" w:type="dxa"/>
-              <w:left w:w="100" w:type="dxa"/>
-              <w:bottom w:w="60" w:type="dxa"/>
-              <w:right w:w="100" w:type="dxa"/>
-            </w:tcMar>
-          </w:tcPr>
-          <w:p>
-            <w:pPr>
-              <w:spacing w:line="264" w:lineRule="auto"/>
-            </w:pPr>
-            <w:r>
-              <w:rPr>
-                <w:sz w:val="19"/>
-                <w:szCs w:val="19"/>
-              </w:rPr>
-              <w:t>Up to 1 Mbaud+</w:t>
-            </w:r>
-          </w:p>
-        </w:tc>
-        <w:tc>
-          <w:tcPr>
-            <w:tcW w:w="3706" w:type="dxa"/>
-            <w:shd w:val="clear" w:color="auto" w:fill="F3F7FB"/>
-            <w:tcMar>
-              <w:top w:w="60" w:type="dxa"/>
-              <w:left w:w="100" w:type="dxa"/>
-              <w:bottom w:w="60" w:type="dxa"/>
-              <w:right w:w="100" w:type="dxa"/>
-            </w:tcMar>
-          </w:tcPr>
-          <w:p>
-            <w:pPr>
-              <w:spacing w:line="264" w:lineRule="auto"/>
-            </w:pPr>
-            <w:r>
-              <w:rPr>
-                <w:sz w:val="19"/>
-                <w:szCs w:val="19"/>
-              </w:rPr>
-              <w:t>About 57600 baud at most</w:t>
-            </w:r>
-          </w:p>
-        </w:tc>
-      </w:tr>
-      <w:tr>
-        <w:trPr>
-          <w:cantSplit/>
-        </w:trPr>
-        <w:tc>
-          <w:tcPr>
-            <w:tcW w:w="2300" w:type="dxa"/>
-            <w:tcMar>
-              <w:top w:w="60" w:type="dxa"/>
-              <w:left w:w="100" w:type="dxa"/>
-              <w:bottom w:w="60" w:type="dxa"/>
-              <w:right w:w="100" w:type="dxa"/>
-            </w:tcMar>
-          </w:tcPr>
-          <w:p>
-            <w:pPr>
-              <w:spacing w:line="264" w:lineRule="auto"/>
-            </w:pPr>
-            <w:r>
-              <w:rPr>
-                <w:sz w:val="19"/>
-                <w:szCs w:val="19"/>
-              </w:rPr>
-              <w:t>Used in</w:t>
-            </w:r>
-          </w:p>
-        </w:tc>
-        <w:tc>
-          <w:tcPr>
-            <w:tcW w:w="3700" w:type="dxa"/>
-            <w:tcMar>
-              <w:top w:w="60" w:type="dxa"/>
-              <w:left w:w="100" w:type="dxa"/>
-              <w:bottom w:w="60" w:type="dxa"/>
-              <w:right w:w="100" w:type="dxa"/>
-            </w:tcMar>
-          </w:tcPr>
-          <w:p>
-            <w:pPr>
-              <w:spacing w:line="264" w:lineRule="auto"/>
-            </w:pPr>
-            <w:r>
-              <w:rPr>
-                <w:sz w:val="19"/>
-                <w:szCs w:val="19"/>
-              </w:rPr>
-              <w:t>Task 1 (loopback)</w:t>
-            </w:r>
-          </w:p>
-        </w:tc>
-        <w:tc>
-          <w:tcPr>
-            <w:tcW w:w="3706" w:type="dxa"/>
-            <w:tcMar>
-              <w:top w:w="60" w:type="dxa"/>
-              <w:left w:w="100" w:type="dxa"/>
-              <w:bottom w:w="60" w:type="dxa"/>
-              <w:right w:w="100" w:type="dxa"/>
-            </w:tcMar>
-          </w:tcPr>
-          <w:p>
-            <w:pPr>
-              <w:spacing w:line="264" w:lineRule="auto"/>
-            </w:pPr>
-            <w:r>
-              <w:rPr>
-                <w:sz w:val="19"/>
-                <w:szCs w:val="19"/>
-              </w:rPr>
-              <w:t>Tasks 2 and 3 (board to board)</w:t>
-            </w:r>
-          </w:p>
-        </w:tc>
-      </w:tr>
-    </w:tbl>
-    <w:p>
-      <w:pPr>
-        <w:spacing w:after="120"/>
-        <w:rPr>
-          <w:sz w:val="8"/>
-        </w:rPr>
-      </w:pPr>
-    </w:p>
-    <w:tbl>
-      <w:tblPr>
-        <w:tblW w:w="9706" w:type="dxa"/>
-        <w:tblLayout w:type="fixed"/>
-        <w:tblLook w:val="04A0" w:firstRow="1" w:lastRow="0" w:firstColumn="1" w:lastColumn="0" w:noHBand="0" w:noVBand="1"/>
-      </w:tblPr>
-      <w:tblGrid>
-        <w:gridCol w:w="9706"/>
-      </w:tblGrid>
-      <w:tr>
-        <w:trPr>
-          <w:cantSplit/>
-        </w:trPr>
-        <w:tc>
-          <w:tcPr>
-            <w:tcW w:w="9706" w:type="dxa"/>
-            <w:tcBorders>
-              <w:top w:val="nil"/>
-              <w:left w:val="single" w:sz="24" w:space="0" w:color="2E74B5"/>
-              <w:bottom w:val="nil"/>
-              <w:right w:val="nil"/>
-            </w:tcBorders>
-            <w:shd w:val="clear" w:color="auto" w:fill="EAF2FB"/>
-            <w:tcMar>
-              <w:top w:w="100" w:type="dxa"/>
-              <w:left w:w="180" w:type="dxa"/>
-              <w:bottom w:w="60" w:type="dxa"/>
-              <w:right w:w="160" w:type="dxa"/>
-            </w:tcMar>
-          </w:tcPr>
-          <w:p>
-            <w:pPr>
-              <w:keepNext/>
-              <w:spacing w:after="60" w:line="264" w:lineRule="auto"/>
-            </w:pPr>
-            <w:r>
-              <w:rPr>
-                <w:b/>
-                <w:bCs/>
-                <w:color w:val="2E74B5"/>
-              </w:rPr>
-              <w:t>Why two kinds?</w:t>
-            </w:r>
-          </w:p>
-          <w:p>
-            <w:pPr>
-              <w:spacing w:after="60" w:line="264" w:lineRule="auto"/>
-            </w:pPr>
-            <w:r>
-              <w:t xml:space="preserve">The loopback test </w:t>
-            </w:r>
-            <w:r>
-              <w:rPr>
-                <w:b/>
-                <w:bCs/>
-              </w:rPr>
-              <w:t>must</w:t>
-            </w:r>
-            <w:r>
-              <w:t xml:space="preserve"> use the hardware UART: a SoftwareSerial port cannot listen to itself while it is sending. For the two-board link, SoftwareSerial keeps the hardware pins free and the USB </w:t>
-            </w:r>
-            <w:r>
-              <w:rPr>
-                <w:rFonts w:ascii="Consolas" w:hAnsi="Consolas" w:cs="Consolas"/>
-                <w:color w:val="C7254E"/>
-                <w:sz w:val="20"/>
-                <w:szCs w:val="20"/>
-                <w:shd w:val="clear" w:color="auto" w:fill="F4F4F4"/>
-              </w:rPr>
-              <w:t>Serial</w:t>
-            </w:r>
-            <w:r>
-              <w:t xml:space="preserve"> Monitor available for debugging.</w:t>
-            </w:r>
-          </w:p>
-        </w:tc>
-      </w:tr>
-    </w:tbl>
-    <w:p>
-      <w:pPr>
-        <w:spacing w:after="120"/>
-        <w:rPr>
-          <w:sz w:val="8"/>
-        </w:rPr>
-      </w:pPr>
-    </w:p>
-    <w:p>
-      <w:pPr>
-        <w:pStyle w:val="Heading2"/>
-        <w:keepNext/>
-        <w:spacing w:before="240" w:after="80"/>
-      </w:pPr>
-      <w:r>
-        <w:rPr>
-          <w:b/>
-          <w:bCs/>
-        </w:rPr>
-        <w:t>Writing efficient code for a small microcontroller</w:t>
-      </w:r>
-    </w:p>
-    <w:p>
-      <w:pPr>
-        <w:spacing w:after="60" w:line="264" w:lineRule="auto"/>
-      </w:pPr>
-      <w:r>
-        <w:t xml:space="preserve">The classic Nano has only </w:t>
-      </w:r>
-      <w:r>
-        <w:rPr>
-          <w:b/>
-          <w:bCs/>
-        </w:rPr>
-        <w:t>2 KB of RAM</w:t>
-      </w:r>
-      <w:r>
-        <w:t xml:space="preserve"> and </w:t>
-      </w:r>
-      <w:r>
-        <w:rPr>
-          <w:b/>
-          <w:bCs/>
-        </w:rPr>
-        <w:t>32 KB of flash</w:t>
-      </w:r>
-      <w:r>
-        <w:t>. The code in this lab uses a few habits that keep it small, fast and reliable. Look out for them as you read the listings:</w:t>
-      </w:r>
-    </w:p>
-    <w:tbl>
-      <w:tblPr>
-        <w:tblW w:w="9706" w:type="dxa"/>
-        <w:tblBorders>
-          <w:top w:val="single" w:sz="4" w:space="0" w:color="BFBFBF"/>
-          <w:left w:val="single" w:sz="4" w:space="0" w:color="BFBFBF"/>
-          <w:bottom w:val="single" w:sz="4" w:space="0" w:color="BFBFBF"/>
-          <w:right w:val="single" w:sz="4" w:space="0" w:color="BFBFBF"/>
-          <w:insideH w:val="single" w:sz="4" w:space="0" w:color="BFBFBF"/>
-          <w:insideV w:val="single" w:sz="4" w:space="0" w:color="BFBFBF"/>
-        </w:tblBorders>
-        <w:tblLayout w:type="fixed"/>
-        <w:tblLook w:val="04A0" w:firstRow="1" w:lastRow="0" w:firstColumn="1" w:lastColumn="0" w:noHBand="0" w:noVBand="1"/>
-      </w:tblPr>
-      <w:tblGrid>
-        <w:gridCol w:w="2300"/>
-        <w:gridCol w:w="3500"/>
-        <w:gridCol w:w="3906"/>
-      </w:tblGrid>
-      <w:tr>
-        <w:trPr>
-          <w:cantSplit/>
-          <w:tblHeader/>
-        </w:trPr>
-        <w:tc>
-          <w:tcPr>
-            <w:tcW w:w="2300" w:type="dxa"/>
-            <w:shd w:val="clear" w:color="auto" w:fill="2E74B5"/>
-            <w:tcMar>
-              <w:top w:w="60" w:type="dxa"/>
-              <w:left w:w="100" w:type="dxa"/>
-              <w:bottom w:w="60" w:type="dxa"/>
-              <w:right w:w="100" w:type="dxa"/>
-            </w:tcMar>
-          </w:tcPr>
-          <w:p>
-            <w:pPr>
-              <w:spacing w:line="264" w:lineRule="auto"/>
-            </w:pPr>
-            <w:r>
-              <w:rPr>
-                <w:b/>
-                <w:bCs/>
-                <w:color w:val="FFFFFF"/>
-                <w:sz w:val="19"/>
-                <w:szCs w:val="19"/>
-              </w:rPr>
-              <w:t>Technique</w:t>
-            </w:r>
-          </w:p>
-        </w:tc>
-        <w:tc>
-          <w:tcPr>
-            <w:tcW w:w="3500" w:type="dxa"/>
-            <w:shd w:val="clear" w:color="auto" w:fill="2E74B5"/>
-            <w:tcMar>
-              <w:top w:w="60" w:type="dxa"/>
-              <w:left w:w="100" w:type="dxa"/>
-              <w:bottom w:w="60" w:type="dxa"/>
-              <w:right w:w="100" w:type="dxa"/>
-            </w:tcMar>
-          </w:tcPr>
-          <w:p>
-            <w:pPr>
-              <w:spacing w:line="264" w:lineRule="auto"/>
-            </w:pPr>
-            <w:r>
-              <w:rPr>
-                <w:b/>
-                <w:bCs/>
-                <w:color w:val="FFFFFF"/>
-                <w:sz w:val="19"/>
-                <w:szCs w:val="19"/>
-              </w:rPr>
-              <w:t>Example</w:t>
-            </w:r>
-          </w:p>
-        </w:tc>
-        <w:tc>
-          <w:tcPr>
-            <w:tcW w:w="3906" w:type="dxa"/>
-            <w:shd w:val="clear" w:color="auto" w:fill="2E74B5"/>
-            <w:tcMar>
-              <w:top w:w="60" w:type="dxa"/>
-              <w:left w:w="100" w:type="dxa"/>
-              <w:bottom w:w="60" w:type="dxa"/>
-              <w:right w:w="100" w:type="dxa"/>
-            </w:tcMar>
-          </w:tcPr>
-          <w:p>
-            <w:pPr>
-              <w:spacing w:line="264" w:lineRule="auto"/>
-            </w:pPr>
-            <w:r>
-              <w:rPr>
-                <w:b/>
-                <w:bCs/>
-                <w:color w:val="FFFFFF"/>
-                <w:sz w:val="19"/>
-                <w:szCs w:val="19"/>
-              </w:rPr>
-              <w:t>Why</w:t>
-            </w:r>
-          </w:p>
-        </w:tc>
-      </w:tr>
-      <w:tr>
-        <w:trPr>
-          <w:cantSplit/>
-        </w:trPr>
-        <w:tc>
-          <w:tcPr>
-            <w:tcW w:w="2300" w:type="dxa"/>
-            <w:tcMar>
-              <w:top w:w="60" w:type="dxa"/>
-              <w:left w:w="100" w:type="dxa"/>
-              <w:bottom w:w="60" w:type="dxa"/>
-              <w:right w:w="100" w:type="dxa"/>
-            </w:tcMar>
-          </w:tcPr>
-          <w:p>
-            <w:pPr>
-              <w:spacing w:line="264" w:lineRule="auto"/>
-            </w:pPr>
-            <w:r>
-              <w:rPr>
-                <w:rFonts w:ascii="Consolas" w:hAnsi="Consolas" w:cs="Consolas"/>
-                <w:color w:val="C7254E"/>
-                <w:sz w:val="17"/>
-                <w:szCs w:val="17"/>
-                <w:shd w:val="clear" w:color="auto" w:fill="F4F4F4"/>
-              </w:rPr>
-              <w:t>F()</w:t>
-            </w:r>
-            <w:r>
-              <w:rPr>
-                <w:sz w:val="19"/>
-                <w:szCs w:val="19"/>
-              </w:rPr>
-              <w:t xml:space="preserve"> macro for fixed text</w:t>
-            </w:r>
-          </w:p>
-        </w:tc>
-        <w:tc>
-          <w:tcPr>
-            <w:tcW w:w="3500" w:type="dxa"/>
-            <w:tcMar>
-              <w:top w:w="60" w:type="dxa"/>
-              <w:left w:w="100" w:type="dxa"/>
-              <w:bottom w:w="60" w:type="dxa"/>
-              <w:right w:w="100" w:type="dxa"/>
-            </w:tcMar>
-          </w:tcPr>
-          <w:p>
-            <w:pPr>
-              <w:spacing w:line="264" w:lineRule="auto"/>
-            </w:pPr>
-            <w:r>
-              <w:rPr>
-                <w:rFonts w:ascii="Consolas" w:hAnsi="Consolas" w:cs="Consolas"/>
-                <w:color w:val="C7254E"/>
-                <w:sz w:val="17"/>
-                <w:szCs w:val="17"/>
-                <w:shd w:val="clear" w:color="auto" w:fill="F4F4F4"/>
-              </w:rPr>
-              <w:t>Serial.println(F("Sender ready"));</w:t>
-            </w:r>
-          </w:p>
-        </w:tc>
-        <w:tc>
-          <w:tcPr>
-            <w:tcW w:w="3906" w:type="dxa"/>
-            <w:tcMar>
-              <w:top w:w="60" w:type="dxa"/>
-              <w:left w:w="100" w:type="dxa"/>
-              <w:bottom w:w="60" w:type="dxa"/>
-              <w:right w:w="100" w:type="dxa"/>
-            </w:tcMar>
-          </w:tcPr>
-          <w:p>
-            <w:pPr>
-              <w:spacing w:line="264" w:lineRule="auto"/>
-            </w:pPr>
-            <w:r>
-              <w:rPr>
-                <w:sz w:val="19"/>
-                <w:szCs w:val="19"/>
-              </w:rPr>
-              <w:t xml:space="preserve">Keeps the text in flash. Without </w:t>
-            </w:r>
-            <w:r>
-              <w:rPr>
-                <w:rFonts w:ascii="Consolas" w:hAnsi="Consolas" w:cs="Consolas"/>
-                <w:color w:val="C7254E"/>
-                <w:sz w:val="17"/>
-                <w:szCs w:val="17"/>
-                <w:shd w:val="clear" w:color="auto" w:fill="F4F4F4"/>
-              </w:rPr>
-              <w:t>F()</w:t>
-            </w:r>
-            <w:r>
-              <w:rPr>
-                <w:sz w:val="19"/>
-                <w:szCs w:val="19"/>
-              </w:rPr>
-              <w:t>, every string literal is also copied into RAM at start-up.</w:t>
-            </w:r>
-          </w:p>
-        </w:tc>
-      </w:tr>
-      <w:tr>
-        <w:trPr>
-          <w:cantSplit/>
-        </w:trPr>
-        <w:tc>
-          <w:tcPr>
-            <w:tcW w:w="2300" w:type="dxa"/>
-            <w:shd w:val="clear" w:color="auto" w:fill="F3F7FB"/>
-            <w:tcMar>
-              <w:top w:w="60" w:type="dxa"/>
-              <w:left w:w="100" w:type="dxa"/>
-              <w:bottom w:w="60" w:type="dxa"/>
-              <w:right w:w="100" w:type="dxa"/>
-            </w:tcMar>
-          </w:tcPr>
-          <w:p>
-            <w:pPr>
-              <w:spacing w:line="264" w:lineRule="auto"/>
-            </w:pPr>
-            <w:r>
-              <w:rPr>
-                <w:sz w:val="19"/>
-                <w:szCs w:val="19"/>
-              </w:rPr>
-              <w:t>Smallest suitable type</w:t>
-            </w:r>
-          </w:p>
-        </w:tc>
-        <w:tc>
-          <w:tcPr>
-            <w:tcW w:w="3500" w:type="dxa"/>
-            <w:shd w:val="clear" w:color="auto" w:fill="F3F7FB"/>
-            <w:tcMar>
-              <w:top w:w="60" w:type="dxa"/>
-              <w:left w:w="100" w:type="dxa"/>
-              <w:bottom w:w="60" w:type="dxa"/>
-              <w:right w:w="100" w:type="dxa"/>
-            </w:tcMar>
-          </w:tcPr>
-          <w:p>
-            <w:pPr>
-              <w:spacing w:line="264" w:lineRule="auto"/>
-            </w:pPr>
-            <w:r>
-              <w:rPr>
-                <w:rFonts w:ascii="Consolas" w:hAnsi="Consolas" w:cs="Consolas"/>
-                <w:color w:val="C7254E"/>
-                <w:sz w:val="17"/>
-                <w:szCs w:val="17"/>
-                <w:shd w:val="clear" w:color="auto" w:fill="F4F4F4"/>
-              </w:rPr>
-              <w:t>uint8_t len;</w:t>
-            </w:r>
-            <w:r>
-              <w:rPr>
-                <w:sz w:val="19"/>
-                <w:szCs w:val="19"/>
-              </w:rPr>
-              <w:t xml:space="preserve"> instead of </w:t>
-            </w:r>
-            <w:r>
-              <w:rPr>
-                <w:rFonts w:ascii="Consolas" w:hAnsi="Consolas" w:cs="Consolas"/>
-                <w:color w:val="C7254E"/>
-                <w:sz w:val="17"/>
-                <w:szCs w:val="17"/>
-                <w:shd w:val="clear" w:color="auto" w:fill="F4F4F4"/>
-              </w:rPr>
-              <w:t>int len;</w:t>
-            </w:r>
-          </w:p>
-        </w:tc>
-        <w:tc>
-          <w:tcPr>
-            <w:tcW w:w="3906" w:type="dxa"/>
-            <w:shd w:val="clear" w:color="auto" w:fill="F3F7FB"/>
-            <w:tcMar>
-              <w:top w:w="60" w:type="dxa"/>
-              <w:left w:w="100" w:type="dxa"/>
-              <w:bottom w:w="60" w:type="dxa"/>
-              <w:right w:w="100" w:type="dxa"/>
-            </w:tcMar>
-          </w:tcPr>
-          <w:p>
-            <w:pPr>
-              <w:spacing w:line="264" w:lineRule="auto"/>
-            </w:pPr>
-            <w:r>
-              <w:rPr>
-                <w:sz w:val="19"/>
-                <w:szCs w:val="19"/>
-              </w:rPr>
-              <w:t>1 byte instead of 2, and faster on an 8-bit CPU. Use it for values that stay between 0 and 255.</w:t>
-            </w:r>
-          </w:p>
-        </w:tc>
-      </w:tr>
-      <w:tr>
-        <w:trPr>
-          <w:cantSplit/>
-        </w:trPr>
-        <w:tc>
-          <w:tcPr>
-            <w:tcW w:w="2300" w:type="dxa"/>
-            <w:tcMar>
-              <w:top w:w="60" w:type="dxa"/>
-              <w:left w:w="100" w:type="dxa"/>
-              <w:bottom w:w="60" w:type="dxa"/>
-              <w:right w:w="100" w:type="dxa"/>
-            </w:tcMar>
-          </w:tcPr>
-          <w:p>
-            <w:pPr>
-              <w:spacing w:line="264" w:lineRule="auto"/>
-            </w:pPr>
-            <w:r>
-              <w:rPr>
-                <w:sz w:val="19"/>
-                <w:szCs w:val="19"/>
-              </w:rPr>
-              <w:t>Let the compiler count</w:t>
-            </w:r>
-          </w:p>
-        </w:tc>
-        <w:tc>
-          <w:tcPr>
-            <w:tcW w:w="3500" w:type="dxa"/>
-            <w:tcMar>
-              <w:top w:w="60" w:type="dxa"/>
-              <w:left w:w="100" w:type="dxa"/>
-              <w:bottom w:w="60" w:type="dxa"/>
-              <w:right w:w="100" w:type="dxa"/>
-            </w:tcMar>
-          </w:tcPr>
-          <w:p>
-            <w:pPr>
-              <w:spacing w:line="264" w:lineRule="auto"/>
-            </w:pPr>
-            <w:r>
-              <w:rPr>
-                <w:rFonts w:ascii="Consolas" w:hAnsi="Consolas" w:cs="Consolas"/>
-                <w:color w:val="C7254E"/>
-                <w:sz w:val="17"/>
-                <w:szCs w:val="17"/>
-                <w:shd w:val="clear" w:color="auto" w:fill="F4F4F4"/>
-              </w:rPr>
-              <w:t>sizeof(messages) / sizeof(messages[0])</w:t>
-            </w:r>
-          </w:p>
-        </w:tc>
-        <w:tc>
-          <w:tcPr>
-            <w:tcW w:w="3906" w:type="dxa"/>
-            <w:tcMar>
-              <w:top w:w="60" w:type="dxa"/>
-              <w:left w:w="100" w:type="dxa"/>
-              <w:bottom w:w="60" w:type="dxa"/>
-              <w:right w:w="100" w:type="dxa"/>
-            </w:tcMar>
-          </w:tcPr>
-          <w:p>
-            <w:pPr>
-              <w:spacing w:line="264" w:lineRule="auto"/>
-            </w:pPr>
-            <w:r>
-              <w:rPr>
-                <w:sz w:val="19"/>
-                <w:szCs w:val="19"/>
-              </w:rPr>
-              <w:t xml:space="preserve">Add a message to the array and the count updates itself. There is no hand-typed </w:t>
-            </w:r>
-            <w:r>
-              <w:rPr>
-                <w:rFonts w:ascii="Consolas" w:hAnsi="Consolas" w:cs="Consolas"/>
-                <w:color w:val="C7254E"/>
-                <w:sz w:val="17"/>
-                <w:szCs w:val="17"/>
-                <w:shd w:val="clear" w:color="auto" w:fill="F4F4F4"/>
-              </w:rPr>
-              <w:t>3</w:t>
-            </w:r>
-            <w:r>
-              <w:rPr>
-                <w:sz w:val="19"/>
-                <w:szCs w:val="19"/>
-              </w:rPr>
-              <w:t xml:space="preserve"> to forget.</w:t>
-            </w:r>
-          </w:p>
-        </w:tc>
-      </w:tr>
-      <w:tr>
-        <w:trPr>
-          <w:cantSplit/>
-        </w:trPr>
-        <w:tc>
-          <w:tcPr>
-            <w:tcW w:w="2300" w:type="dxa"/>
-            <w:shd w:val="clear" w:color="auto" w:fill="F3F7FB"/>
-            <w:tcMar>
-              <w:top w:w="60" w:type="dxa"/>
-              <w:left w:w="100" w:type="dxa"/>
-              <w:bottom w:w="60" w:type="dxa"/>
-              <w:right w:w="100" w:type="dxa"/>
-            </w:tcMar>
-          </w:tcPr>
-          <w:p>
-            <w:pPr>
-              <w:spacing w:line="264" w:lineRule="auto"/>
-            </w:pPr>
-            <w:r>
-              <w:rPr>
-                <w:sz w:val="19"/>
-                <w:szCs w:val="19"/>
-              </w:rPr>
-              <w:lastRenderedPageBreak/>
-              <w:t>Drift-free timing</w:t>
-            </w:r>
-          </w:p>
-        </w:tc>
-        <w:tc>
-          <w:tcPr>
-            <w:tcW w:w="3500" w:type="dxa"/>
-            <w:shd w:val="clear" w:color="auto" w:fill="F3F7FB"/>
-            <w:tcMar>
-              <w:top w:w="60" w:type="dxa"/>
-              <w:left w:w="100" w:type="dxa"/>
-              <w:bottom w:w="60" w:type="dxa"/>
-              <w:right w:w="100" w:type="dxa"/>
-            </w:tcMar>
-          </w:tcPr>
-          <w:p>
-            <w:pPr>
-              <w:spacing w:line="264" w:lineRule="auto"/>
-            </w:pPr>
-            <w:r>
-              <w:rPr>
-                <w:rFonts w:ascii="Consolas" w:hAnsi="Consolas" w:cs="Consolas"/>
-                <w:color w:val="C7254E"/>
-                <w:sz w:val="17"/>
-                <w:szCs w:val="17"/>
-                <w:shd w:val="clear" w:color="auto" w:fill="F4F4F4"/>
-              </w:rPr>
-              <w:t>lastSend += SEND_INTERVAL;</w:t>
-            </w:r>
-          </w:p>
-        </w:tc>
-        <w:tc>
-          <w:tcPr>
-            <w:tcW w:w="3906" w:type="dxa"/>
-            <w:shd w:val="clear" w:color="auto" w:fill="F3F7FB"/>
-            <w:tcMar>
-              <w:top w:w="60" w:type="dxa"/>
-              <w:left w:w="100" w:type="dxa"/>
-              <w:bottom w:w="60" w:type="dxa"/>
-              <w:right w:w="100" w:type="dxa"/>
-            </w:tcMar>
-          </w:tcPr>
-          <w:p>
-            <w:pPr>
-              <w:spacing w:line="264" w:lineRule="auto"/>
-            </w:pPr>
-            <w:r>
-              <w:rPr>
-                <w:rFonts w:ascii="Consolas" w:hAnsi="Consolas" w:cs="Consolas"/>
-                <w:color w:val="C7254E"/>
-                <w:sz w:val="17"/>
-                <w:szCs w:val="17"/>
-                <w:shd w:val="clear" w:color="auto" w:fill="F4F4F4"/>
-              </w:rPr>
-              <w:t>lastSend = millis();</w:t>
-            </w:r>
-            <w:r>
-              <w:rPr>
-                <w:sz w:val="19"/>
-                <w:szCs w:val="19"/>
-              </w:rPr>
-              <w:t xml:space="preserve"> slowly drifts, because the check happens a little late each time. Adding the interval keeps an exact period.</w:t>
-            </w:r>
-          </w:p>
-        </w:tc>
-      </w:tr>
-      <w:tr>
-        <w:trPr>
-          <w:cantSplit/>
-        </w:trPr>
-        <w:tc>
-          <w:tcPr>
-            <w:tcW w:w="2300" w:type="dxa"/>
-            <w:tcMar>
-              <w:top w:w="60" w:type="dxa"/>
-              <w:left w:w="100" w:type="dxa"/>
-              <w:bottom w:w="60" w:type="dxa"/>
-              <w:right w:w="100" w:type="dxa"/>
-            </w:tcMar>
-          </w:tcPr>
-          <w:p>
-            <w:pPr>
-              <w:spacing w:line="264" w:lineRule="auto"/>
-            </w:pPr>
-            <w:r>
-              <w:rPr>
-                <w:sz w:val="19"/>
-                <w:szCs w:val="19"/>
-              </w:rPr>
-              <w:t xml:space="preserve">Fixed buffers, not </w:t>
-            </w:r>
-            <w:r>
-              <w:rPr>
-                <w:rFonts w:ascii="Consolas" w:hAnsi="Consolas" w:cs="Consolas"/>
-                <w:color w:val="C7254E"/>
-                <w:sz w:val="17"/>
-                <w:szCs w:val="17"/>
-                <w:shd w:val="clear" w:color="auto" w:fill="F4F4F4"/>
-              </w:rPr>
-              <w:t>String</w:t>
-            </w:r>
-          </w:p>
-        </w:tc>
-        <w:tc>
-          <w:tcPr>
-            <w:tcW w:w="3500" w:type="dxa"/>
-            <w:tcMar>
-              <w:top w:w="60" w:type="dxa"/>
-              <w:left w:w="100" w:type="dxa"/>
-              <w:bottom w:w="60" w:type="dxa"/>
-              <w:right w:w="100" w:type="dxa"/>
-            </w:tcMar>
-          </w:tcPr>
-          <w:p>
-            <w:pPr>
-              <w:spacing w:line="264" w:lineRule="auto"/>
-            </w:pPr>
-            <w:r>
-              <w:rPr>
-                <w:rFonts w:ascii="Consolas" w:hAnsi="Consolas" w:cs="Consolas"/>
-                <w:color w:val="C7254E"/>
-                <w:sz w:val="17"/>
-                <w:szCs w:val="17"/>
-                <w:shd w:val="clear" w:color="auto" w:fill="F4F4F4"/>
-              </w:rPr>
-              <w:t>char buffer[MAX_LEN + 1];</w:t>
-            </w:r>
-          </w:p>
-        </w:tc>
-        <w:tc>
-          <w:tcPr>
-            <w:tcW w:w="3906" w:type="dxa"/>
-            <w:tcMar>
-              <w:top w:w="60" w:type="dxa"/>
-              <w:left w:w="100" w:type="dxa"/>
-              <w:bottom w:w="60" w:type="dxa"/>
-              <w:right w:w="100" w:type="dxa"/>
-            </w:tcMar>
-          </w:tcPr>
-          <w:p>
-            <w:pPr>
-              <w:spacing w:line="264" w:lineRule="auto"/>
-            </w:pPr>
-            <w:r>
-              <w:rPr>
-                <w:sz w:val="19"/>
-                <w:szCs w:val="19"/>
-              </w:rPr>
-              <w:t xml:space="preserve">The Arduino </w:t>
-            </w:r>
-            <w:r>
-              <w:rPr>
-                <w:rFonts w:ascii="Consolas" w:hAnsi="Consolas" w:cs="Consolas"/>
-                <w:color w:val="C7254E"/>
-                <w:sz w:val="17"/>
-                <w:szCs w:val="17"/>
-                <w:shd w:val="clear" w:color="auto" w:fill="F4F4F4"/>
-              </w:rPr>
-              <w:t>String</w:t>
-            </w:r>
-            <w:r>
-              <w:rPr>
-                <w:sz w:val="19"/>
-                <w:szCs w:val="19"/>
-              </w:rPr>
-              <w:t xml:space="preserve"> class allocates memory at run time, which fragments the heap and can crash a long-running sketch.</w:t>
-            </w:r>
-          </w:p>
-        </w:tc>
-      </w:tr>
-      <w:tr>
-        <w:trPr>
-          <w:cantSplit/>
-        </w:trPr>
-        <w:tc>
-          <w:tcPr>
-            <w:tcW w:w="2300" w:type="dxa"/>
-            <w:shd w:val="clear" w:color="auto" w:fill="F3F7FB"/>
-            <w:tcMar>
-              <w:top w:w="60" w:type="dxa"/>
-              <w:left w:w="100" w:type="dxa"/>
-              <w:bottom w:w="60" w:type="dxa"/>
-              <w:right w:w="100" w:type="dxa"/>
-            </w:tcMar>
-          </w:tcPr>
-          <w:p>
-            <w:pPr>
-              <w:spacing w:line="264" w:lineRule="auto"/>
-            </w:pPr>
-            <w:r>
-              <w:rPr>
-                <w:sz w:val="19"/>
-                <w:szCs w:val="19"/>
-              </w:rPr>
-              <w:t>Overwrite the LCD, don’t clear it</w:t>
-            </w:r>
-          </w:p>
-        </w:tc>
-        <w:tc>
-          <w:tcPr>
-            <w:tcW w:w="3500" w:type="dxa"/>
-            <w:shd w:val="clear" w:color="auto" w:fill="F3F7FB"/>
-            <w:tcMar>
-              <w:top w:w="60" w:type="dxa"/>
-              <w:left w:w="100" w:type="dxa"/>
-              <w:bottom w:w="60" w:type="dxa"/>
-              <w:right w:w="100" w:type="dxa"/>
-            </w:tcMar>
-          </w:tcPr>
-          <w:p>
-            <w:pPr>
-              <w:spacing w:line="264" w:lineRule="auto"/>
-            </w:pPr>
-            <w:r>
-              <w:rPr>
-                <w:rFonts w:ascii="Consolas" w:hAnsi="Consolas" w:cs="Consolas"/>
-                <w:color w:val="C7254E"/>
-                <w:sz w:val="17"/>
-                <w:szCs w:val="17"/>
-                <w:shd w:val="clear" w:color="auto" w:fill="F4F4F4"/>
-              </w:rPr>
-              <w:t>lcdPrintLine(1, msg);</w:t>
-            </w:r>
-          </w:p>
-        </w:tc>
-        <w:tc>
-          <w:tcPr>
-            <w:tcW w:w="3906" w:type="dxa"/>
-            <w:shd w:val="clear" w:color="auto" w:fill="F3F7FB"/>
-            <w:tcMar>
-              <w:top w:w="60" w:type="dxa"/>
-              <w:left w:w="100" w:type="dxa"/>
-              <w:bottom w:w="60" w:type="dxa"/>
-              <w:right w:w="100" w:type="dxa"/>
-            </w:tcMar>
-          </w:tcPr>
-          <w:p>
-            <w:pPr>
-              <w:spacing w:line="264" w:lineRule="auto"/>
-            </w:pPr>
-            <w:r>
-              <w:rPr>
-                <w:rFonts w:ascii="Consolas" w:hAnsi="Consolas" w:cs="Consolas"/>
-                <w:color w:val="C7254E"/>
-                <w:sz w:val="17"/>
-                <w:szCs w:val="17"/>
-                <w:shd w:val="clear" w:color="auto" w:fill="F4F4F4"/>
-              </w:rPr>
-              <w:t>lcd.clear()</w:t>
-            </w:r>
-            <w:r>
-              <w:rPr>
-                <w:sz w:val="19"/>
-                <w:szCs w:val="19"/>
-              </w:rPr>
-              <w:t xml:space="preserve"> takes about 2 ms and makes the screen flicker. Writing a full 16-character line, padded with spaces, does neither.</w:t>
-            </w:r>
-          </w:p>
-        </w:tc>
-      </w:tr>
-    </w:tbl>
-    <w:p>
-      <w:pPr>
-        <w:spacing w:after="120"/>
-        <w:rPr>
-          <w:sz w:val="8"/>
-        </w:rPr>
-      </w:pPr>
-    </w:p>
-    <w:p>
-      <w:pPr>
-        <w:pStyle w:val="Heading1"/>
-        <w:keepNext/>
-        <w:spacing w:before="360" w:after="120"/>
-      </w:pPr>
-      <w:r>
-        <w:rPr>
-          <w:b/>
-          <w:bCs/>
-        </w:rPr>
-        <w:t>3  Task 1: UART loopback on a single board</w:t>
+        <w:t xml:space="preserve">2  Task 1: UART loopback on a single board</w:t>
       </w:r>
     </w:p>
     <w:p>
@@ -8667,7 +6156,7 @@
         <w:spacing w:after="120" w:line="264" w:lineRule="auto"/>
       </w:pPr>
       <w:r>
-        <w:t xml:space="preserve">Using the frame diagram in Section 2, how long does it take to transmit the word </w:t>
+        <w:t xml:space="preserve">Each character is sent as a 10-bit frame (1 start bit, 8 data bits, 1 stop bit), and at 9600 baud each bit lasts 1/9600 s. How long does it take to transmit the word </w:t>
       </w:r>
       <w:r>
         <w:rPr>
@@ -8764,7 +6253,7 @@
           <w:b/>
           <w:bCs/>
         </w:rPr>
-        <w:t>4  Task 2: Communication between two boards</w:t>
+        <w:t xml:space="preserve">3  Task 2: Communication between two boards</w:t>
       </w:r>
     </w:p>
     <w:p>
@@ -14525,7 +12014,7 @@
         <w:t>(record)</w:t>
       </w:r>
       <w:r>
-        <w:t xml:space="preserve"> Fill in the table and explain each result using Section 2.</w:t>
+        <w:t xml:space="preserve"> Fill in the table and explain each result. Think about the baud rate (both boards must use the same one), which pin drives which (TX must go to RX), and the shared ground.</w:t>
       </w:r>
     </w:p>
     <w:tbl>
@@ -15157,7 +12646,7 @@
           <w:b/>
           <w:bCs/>
         </w:rPr>
-        <w:t>5  Task 3: Message integrity with SHA-1</w:t>
+        <w:t xml:space="preserve">4  Task 3: Message integrity with SHA-1</w:t>
       </w:r>
     </w:p>
     <w:p>
@@ -23998,7 +21487,7 @@
           <w:b/>
           <w:bCs/>
         </w:rPr>
-        <w:t>6  Extension: acknowledgements (ACK/NACK)</w:t>
+        <w:t xml:space="preserve">5  Extension: acknowledgements (ACK/NACK)</w:t>
       </w:r>
     </w:p>
     <w:p>
@@ -33960,7 +31449,7 @@
           <w:b/>
           <w:bCs/>
         </w:rPr>
-        <w:t>7  Submission checklist</w:t>
+        <w:t xml:space="preserve">6  Submission checklist</w:t>
       </w:r>
     </w:p>
     <w:p>

</xml_diff>